<commit_message>
Aggiornamento TestPlan e Test Cases Specification
</commit_message>
<xml_diff>
--- a/Deliverables/Test Cases Specification Document_LaCantina.docx
+++ b/Deliverables/Test Cases Specification Document_LaCantina.docx
@@ -2357,21 +2357,7 @@
                 <w:rStyle w:val="Collegamentoipertestuale"/>
                 <w:noProof/>
               </w:rPr>
-              <w:t>TC_U</w:t>
-            </w:r>
-            <w:r>
-              <w:rPr>
-                <w:rStyle w:val="Collegamentoipertestuale"/>
-                <w:noProof/>
-              </w:rPr>
-              <w:t>M</w:t>
-            </w:r>
-            <w:r>
-              <w:rPr>
-                <w:rStyle w:val="Collegamentoipertestuale"/>
-                <w:noProof/>
-              </w:rPr>
-              <w:t>_02 – Validazione password in registrazione (UC2)</w:t>
+              <w:t>TC_UM_02 – Validazione password in registrazione (UC2)</w:t>
             </w:r>
             <w:r>
               <w:rPr>
@@ -4216,21 +4202,7 @@
                 <w:rStyle w:val="Collegamentoipertestuale"/>
                 <w:noProof/>
               </w:rPr>
-              <w:t>TC_U</w:t>
-            </w:r>
-            <w:r>
-              <w:rPr>
-                <w:rStyle w:val="Collegamentoipertestuale"/>
-                <w:noProof/>
-              </w:rPr>
-              <w:t>M</w:t>
-            </w:r>
-            <w:r>
-              <w:rPr>
-                <w:rStyle w:val="Collegamentoipertestuale"/>
-                <w:noProof/>
-              </w:rPr>
-              <w:t>_02 – Filtraggio prodotti per categoria</w:t>
+              <w:t>TC_UM_02 – Filtraggio prodotti per categoria</w:t>
             </w:r>
             <w:r>
               <w:rPr>
@@ -9952,8 +9924,125 @@
         <w:t>DB: tabella utenti</w:t>
       </w:r>
     </w:p>
-    <w:p/>
-    <w:p/>
+    <w:p>
+      <w:pPr>
+        <w:pStyle w:val="Titolo3"/>
+        <w:rPr>
+          <w:b/>
+          <w:bCs/>
+          <w:szCs w:val="28"/>
+        </w:rPr>
+      </w:pPr>
+      <w:r>
+        <w:rPr>
+          <w:b/>
+          <w:bCs/>
+          <w:szCs w:val="28"/>
+        </w:rPr>
+        <w:t>Classi di test</w:t>
+      </w:r>
+    </w:p>
+    <w:p>
+      <w:pPr>
+        <w:pStyle w:val="Paragrafoelenco"/>
+        <w:numPr>
+          <w:ilvl w:val="0"/>
+          <w:numId w:val="14"/>
+        </w:numPr>
+      </w:pPr>
+      <w:r>
+        <w:t>LoginServletIntegrationTest</w:t>
+      </w:r>
+    </w:p>
+    <w:p>
+      <w:pPr>
+        <w:pStyle w:val="Paragrafoelenco"/>
+        <w:numPr>
+          <w:ilvl w:val="1"/>
+          <w:numId w:val="14"/>
+        </w:numPr>
+      </w:pPr>
+      <w:r>
+        <w:t>TF_UM_01</w:t>
+      </w:r>
+    </w:p>
+    <w:p>
+      <w:pPr>
+        <w:pStyle w:val="Paragrafoelenco"/>
+        <w:numPr>
+          <w:ilvl w:val="1"/>
+          <w:numId w:val="14"/>
+        </w:numPr>
+      </w:pPr>
+      <w:r>
+        <w:t>TF_UM_02</w:t>
+      </w:r>
+    </w:p>
+    <w:p>
+      <w:pPr>
+        <w:pStyle w:val="Paragrafoelenco"/>
+        <w:numPr>
+          <w:ilvl w:val="1"/>
+          <w:numId w:val="14"/>
+        </w:numPr>
+      </w:pPr>
+      <w:r>
+        <w:t>TF_UM_03</w:t>
+      </w:r>
+    </w:p>
+    <w:p>
+      <w:pPr>
+        <w:pStyle w:val="Paragrafoelenco"/>
+        <w:numPr>
+          <w:ilvl w:val="0"/>
+          <w:numId w:val="14"/>
+        </w:numPr>
+      </w:pPr>
+      <w:r>
+        <w:t>RegisterServletIntegrationTest</w:t>
+      </w:r>
+    </w:p>
+    <w:p>
+      <w:pPr>
+        <w:pStyle w:val="Paragrafoelenco"/>
+        <w:numPr>
+          <w:ilvl w:val="1"/>
+          <w:numId w:val="14"/>
+        </w:numPr>
+      </w:pPr>
+      <w:r>
+        <w:t>TF_UM_0</w:t>
+      </w:r>
+      <w:r>
+        <w:t>5</w:t>
+      </w:r>
+    </w:p>
+    <w:p>
+      <w:pPr>
+        <w:pStyle w:val="Paragrafoelenco"/>
+        <w:numPr>
+          <w:ilvl w:val="1"/>
+          <w:numId w:val="14"/>
+        </w:numPr>
+      </w:pPr>
+      <w:r>
+        <w:t>TF_UM_0</w:t>
+      </w:r>
+      <w:r>
+        <w:t>4</w:t>
+      </w:r>
+    </w:p>
+    <w:p>
+      <w:pPr>
+        <w:pStyle w:val="Paragrafoelenco"/>
+        <w:ind w:left="1788" w:firstLine="0"/>
+      </w:pPr>
+    </w:p>
+    <w:p>
+      <w:pPr>
+        <w:ind w:left="0" w:firstLine="0"/>
+      </w:pPr>
+    </w:p>
     <w:p>
       <w:pPr>
         <w:pStyle w:val="Titolo2"/>
@@ -10806,7 +10895,11 @@
         </w:rPr>
       </w:pPr>
     </w:p>
-    <w:p/>
+    <w:p>
+      <w:pPr>
+        <w:pStyle w:val="Titolo3"/>
+      </w:pPr>
+    </w:p>
     <w:p/>
     <w:p>
       <w:pPr>
@@ -10863,6 +10956,7 @@
         </w:numPr>
       </w:pPr>
       <w:r>
+        <w:lastRenderedPageBreak/>
         <w:t>Registrazione con email già presente → messaggio “email già registrata”</w:t>
       </w:r>
     </w:p>
@@ -11040,6 +11134,85 @@
       </w:pPr>
       <w:r>
         <w:t>Controller: RegisterServlet</w:t>
+      </w:r>
+    </w:p>
+    <w:p>
+      <w:pPr>
+        <w:pStyle w:val="Titolo3"/>
+        <w:numPr>
+          <w:ilvl w:val="0"/>
+          <w:numId w:val="15"/>
+        </w:numPr>
+        <w:rPr>
+          <w:b/>
+          <w:bCs/>
+          <w:szCs w:val="28"/>
+        </w:rPr>
+      </w:pPr>
+      <w:r>
+        <w:rPr>
+          <w:b/>
+          <w:bCs/>
+          <w:szCs w:val="28"/>
+        </w:rPr>
+        <w:t>Classi di test</w:t>
+      </w:r>
+    </w:p>
+    <w:p>
+      <w:pPr>
+        <w:pStyle w:val="Paragrafoelenco"/>
+        <w:numPr>
+          <w:ilvl w:val="0"/>
+          <w:numId w:val="14"/>
+        </w:numPr>
+      </w:pPr>
+      <w:r>
+        <w:t>RegisterServletIntegrationTest</w:t>
+      </w:r>
+    </w:p>
+    <w:p>
+      <w:pPr>
+        <w:pStyle w:val="Paragrafoelenco"/>
+        <w:numPr>
+          <w:ilvl w:val="1"/>
+          <w:numId w:val="14"/>
+        </w:numPr>
+      </w:pPr>
+      <w:r>
+        <w:t>TF_UM_0</w:t>
+      </w:r>
+      <w:r>
+        <w:t>6</w:t>
+      </w:r>
+    </w:p>
+    <w:p>
+      <w:pPr>
+        <w:pStyle w:val="Paragrafoelenco"/>
+        <w:numPr>
+          <w:ilvl w:val="1"/>
+          <w:numId w:val="14"/>
+        </w:numPr>
+      </w:pPr>
+      <w:r>
+        <w:t>TF_UM_0</w:t>
+      </w:r>
+      <w:r>
+        <w:t>7</w:t>
+      </w:r>
+    </w:p>
+    <w:p>
+      <w:pPr>
+        <w:pStyle w:val="Paragrafoelenco"/>
+        <w:numPr>
+          <w:ilvl w:val="1"/>
+          <w:numId w:val="14"/>
+        </w:numPr>
+      </w:pPr>
+      <w:r>
+        <w:t>TF_UM_0</w:t>
+      </w:r>
+      <w:r>
+        <w:t>8</w:t>
       </w:r>
     </w:p>
     <w:p/>
@@ -11482,6 +11655,7 @@
                 <w:sz w:val="22"/>
                 <w:szCs w:val="22"/>
               </w:rPr>
+              <w:lastRenderedPageBreak/>
               <w:t>TF-UM-0</w:t>
             </w:r>
             <w:r>
@@ -11794,7 +11968,6 @@
       </w:pPr>
       <w:bookmarkStart w:id="11" w:name="_Toc218019513"/>
       <w:r>
-        <w:lastRenderedPageBreak/>
         <w:t>Environmental Needs</w:t>
       </w:r>
       <w:bookmarkEnd w:id="11"/>
@@ -11982,7 +12155,96 @@
         <w:t>DB: tabella utenti</w:t>
       </w:r>
     </w:p>
-    <w:p/>
+    <w:p>
+      <w:pPr>
+        <w:pStyle w:val="Titolo3"/>
+        <w:rPr>
+          <w:b/>
+          <w:bCs/>
+          <w:szCs w:val="28"/>
+        </w:rPr>
+      </w:pPr>
+      <w:r>
+        <w:rPr>
+          <w:b/>
+          <w:bCs/>
+          <w:szCs w:val="28"/>
+        </w:rPr>
+        <w:t>Classi di test</w:t>
+      </w:r>
+    </w:p>
+    <w:p>
+      <w:pPr>
+        <w:pStyle w:val="Paragrafoelenco"/>
+        <w:numPr>
+          <w:ilvl w:val="0"/>
+          <w:numId w:val="14"/>
+        </w:numPr>
+      </w:pPr>
+      <w:r>
+        <w:t>LoginServletIntegrationTest</w:t>
+      </w:r>
+    </w:p>
+    <w:p>
+      <w:pPr>
+        <w:pStyle w:val="Paragrafoelenco"/>
+        <w:numPr>
+          <w:ilvl w:val="1"/>
+          <w:numId w:val="14"/>
+        </w:numPr>
+      </w:pPr>
+      <w:r>
+        <w:t>TF_UM_0</w:t>
+      </w:r>
+      <w:r>
+        <w:t>9</w:t>
+      </w:r>
+    </w:p>
+    <w:p>
+      <w:pPr>
+        <w:pStyle w:val="Paragrafoelenco"/>
+        <w:numPr>
+          <w:ilvl w:val="1"/>
+          <w:numId w:val="14"/>
+        </w:numPr>
+      </w:pPr>
+      <w:r>
+        <w:t>TF_UM_</w:t>
+      </w:r>
+      <w:r>
+        <w:t>10</w:t>
+      </w:r>
+    </w:p>
+    <w:p>
+      <w:pPr>
+        <w:pStyle w:val="Paragrafoelenco"/>
+        <w:numPr>
+          <w:ilvl w:val="1"/>
+          <w:numId w:val="14"/>
+        </w:numPr>
+      </w:pPr>
+      <w:r>
+        <w:t>TF_UM_</w:t>
+      </w:r>
+      <w:r>
+        <w:t>11</w:t>
+      </w:r>
+    </w:p>
+    <w:p>
+      <w:pPr>
+        <w:pStyle w:val="Paragrafoelenco"/>
+        <w:numPr>
+          <w:ilvl w:val="1"/>
+          <w:numId w:val="14"/>
+        </w:numPr>
+      </w:pPr>
+      <w:r>
+        <w:t>TF_UM_1</w:t>
+      </w:r>
+      <w:r>
+        <w:t>2</w:t>
+      </w:r>
+    </w:p>
     <w:p/>
     <w:p>
       <w:pPr>
@@ -12696,7 +12958,6 @@
                 <w:sz w:val="22"/>
                 <w:szCs w:val="22"/>
               </w:rPr>
-              <w:lastRenderedPageBreak/>
               <w:t>TF-UM-12</w:t>
             </w:r>
           </w:p>
@@ -12816,7 +13077,20 @@
         </w:numPr>
       </w:pPr>
       <w:r>
-        <w:t>Credenziali valide utente → redirect home page</w:t>
+        <w:t xml:space="preserve">Credenziali valide utente → </w:t>
+      </w:r>
+      <w:r>
+        <w:rPr>
+          <w:i/>
+          <w:iCs/>
+        </w:rPr>
+        <w:t>forward</w:t>
+      </w:r>
+      <w:r>
+        <w:t xml:space="preserve"> </w:t>
+      </w:r>
+      <w:r>
+        <w:t>messaggio</w:t>
       </w:r>
     </w:p>
     <w:p>
@@ -12828,7 +13102,23 @@
         </w:numPr>
       </w:pPr>
       <w:r>
-        <w:t>Credenziali errate → messaggio di errore + resta sul login</w:t>
+        <w:t xml:space="preserve">Credenziali errate → </w:t>
+      </w:r>
+      <w:r>
+        <w:t xml:space="preserve"> </w:t>
+      </w:r>
+      <w:r>
+        <w:rPr>
+          <w:i/>
+          <w:iCs/>
+        </w:rPr>
+        <w:t>forward</w:t>
+      </w:r>
+      <w:r>
+        <w:t xml:space="preserve"> </w:t>
+      </w:r>
+      <w:r>
+        <w:t>messaggio di errore + resta sul login</w:t>
       </w:r>
     </w:p>
     <w:p>
@@ -12840,7 +13130,20 @@
         </w:numPr>
       </w:pPr>
       <w:r>
-        <w:t>Credenziali admin valide → redirect dashboard/admin area</w:t>
+        <w:t xml:space="preserve">Credenziali admin valide → </w:t>
+      </w:r>
+      <w:r>
+        <w:rPr>
+          <w:i/>
+          <w:iCs/>
+        </w:rPr>
+        <w:t>forward</w:t>
+      </w:r>
+      <w:r>
+        <w:t xml:space="preserve"> </w:t>
+      </w:r>
+      <w:r>
+        <w:t>messaggio</w:t>
       </w:r>
     </w:p>
     <w:p>
@@ -12849,6 +13152,9 @@
           <w:tab w:val="left" w:pos="1065"/>
         </w:tabs>
         <w:ind w:left="0" w:firstLine="0"/>
+        <w:rPr>
+          <w:u w:val="single"/>
+        </w:rPr>
       </w:pPr>
     </w:p>
     <w:p>
@@ -12973,6 +13279,7 @@
       </w:pPr>
       <w:bookmarkStart w:id="21" w:name="_Toc218019523"/>
       <w:r>
+        <w:lastRenderedPageBreak/>
         <w:t>TC_</w:t>
       </w:r>
       <w:r>
@@ -13056,6 +13363,86 @@
       <w:r>
         <w:t>prodotti</w:t>
       </w:r>
+    </w:p>
+    <w:p>
+      <w:pPr>
+        <w:pStyle w:val="Titolo3"/>
+        <w:rPr>
+          <w:b/>
+          <w:bCs/>
+          <w:szCs w:val="28"/>
+        </w:rPr>
+      </w:pPr>
+      <w:r>
+        <w:rPr>
+          <w:b/>
+          <w:bCs/>
+          <w:szCs w:val="28"/>
+        </w:rPr>
+        <w:t>Classi di test</w:t>
+      </w:r>
+    </w:p>
+    <w:p>
+      <w:pPr>
+        <w:pStyle w:val="Paragrafoelenco"/>
+        <w:numPr>
+          <w:ilvl w:val="0"/>
+          <w:numId w:val="14"/>
+        </w:numPr>
+      </w:pPr>
+      <w:r>
+        <w:t>ProdottoDaoTest</w:t>
+      </w:r>
+    </w:p>
+    <w:p>
+      <w:pPr>
+        <w:pStyle w:val="Paragrafoelenco"/>
+        <w:numPr>
+          <w:ilvl w:val="1"/>
+          <w:numId w:val="14"/>
+        </w:numPr>
+      </w:pPr>
+      <w:r>
+        <w:t>TF_</w:t>
+      </w:r>
+      <w:r>
+        <w:t>CM_01</w:t>
+      </w:r>
+    </w:p>
+    <w:p>
+      <w:pPr>
+        <w:pStyle w:val="Paragrafoelenco"/>
+        <w:numPr>
+          <w:ilvl w:val="1"/>
+          <w:numId w:val="14"/>
+        </w:numPr>
+      </w:pPr>
+      <w:r>
+        <w:t>TF_CM_0</w:t>
+      </w:r>
+      <w:r>
+        <w:t>2</w:t>
+      </w:r>
+    </w:p>
+    <w:p>
+      <w:pPr>
+        <w:pStyle w:val="Paragrafoelenco"/>
+        <w:numPr>
+          <w:ilvl w:val="1"/>
+          <w:numId w:val="14"/>
+        </w:numPr>
+      </w:pPr>
+      <w:r>
+        <w:t>TF_CM_0</w:t>
+      </w:r>
+      <w:r>
+        <w:t>3</w:t>
+      </w:r>
+    </w:p>
+    <w:p>
+      <w:pPr>
+        <w:ind w:left="473" w:firstLine="0"/>
+      </w:pPr>
     </w:p>
     <w:p/>
     <w:p/>
@@ -13387,7 +13774,6 @@
                 <w:sz w:val="22"/>
                 <w:szCs w:val="22"/>
               </w:rPr>
-              <w:lastRenderedPageBreak/>
               <w:t>TF-CM-01</w:t>
             </w:r>
           </w:p>
@@ -13826,6 +14212,7 @@
       </w:pPr>
       <w:bookmarkStart w:id="26" w:name="_Toc218019528"/>
       <w:r>
+        <w:lastRenderedPageBreak/>
         <w:t>Special procedural requirements</w:t>
       </w:r>
       <w:bookmarkEnd w:id="26"/>
@@ -13918,10 +14305,13 @@
         </w:numPr>
       </w:pPr>
       <w:r>
-        <w:t xml:space="preserve">UI: </w:t>
-      </w:r>
-      <w:r>
-        <w:t>filtro</w:t>
+        <w:t>DAO</w:t>
+      </w:r>
+      <w:r>
+        <w:t xml:space="preserve">: </w:t>
+      </w:r>
+      <w:r>
+        <w:t>ProdottoDao</w:t>
       </w:r>
     </w:p>
     <w:p>
@@ -13933,10 +14323,13 @@
         </w:numPr>
       </w:pPr>
       <w:r>
-        <w:t xml:space="preserve">Controller: </w:t>
-      </w:r>
-      <w:r>
-        <w:t>DA SCRIVERE</w:t>
+        <w:t>UI</w:t>
+      </w:r>
+      <w:r>
+        <w:t>:</w:t>
+      </w:r>
+      <w:r>
+        <w:t xml:space="preserve"> filtro</w:t>
       </w:r>
     </w:p>
     <w:p/>
@@ -14065,7 +14458,6 @@
           <w:sz w:val="22"/>
           <w:szCs w:val="22"/>
         </w:rPr>
-        <w:lastRenderedPageBreak/>
         <w:t>(Test Frame)</w:t>
       </w:r>
       <w:r>
@@ -14658,6 +15050,7 @@
         </w:numPr>
       </w:pPr>
       <w:r>
+        <w:lastRenderedPageBreak/>
         <w:t>Script automatico (se presente): IMG_COD_00</w:t>
       </w:r>
     </w:p>
@@ -14788,15 +15181,127 @@
         <w:t>DAO: UtenteDAO</w:t>
       </w:r>
     </w:p>
+    <w:p>
+      <w:pPr>
+        <w:pStyle w:val="Titolo3"/>
+        <w:numPr>
+          <w:ilvl w:val="0"/>
+          <w:numId w:val="16"/>
+        </w:numPr>
+        <w:rPr>
+          <w:b/>
+          <w:bCs/>
+          <w:szCs w:val="28"/>
+        </w:rPr>
+      </w:pPr>
+      <w:r>
+        <w:rPr>
+          <w:b/>
+          <w:bCs/>
+          <w:szCs w:val="28"/>
+        </w:rPr>
+        <w:t>Classi di test</w:t>
+      </w:r>
+    </w:p>
+    <w:p>
+      <w:pPr>
+        <w:pStyle w:val="Paragrafoelenco"/>
+        <w:numPr>
+          <w:ilvl w:val="0"/>
+          <w:numId w:val="14"/>
+        </w:numPr>
+      </w:pPr>
+      <w:r>
+        <w:t>CarrelloServletIntegrationTest</w:t>
+      </w:r>
+    </w:p>
+    <w:p>
+      <w:pPr>
+        <w:pStyle w:val="Paragrafoelenco"/>
+        <w:numPr>
+          <w:ilvl w:val="1"/>
+          <w:numId w:val="14"/>
+        </w:numPr>
+      </w:pPr>
+      <w:r>
+        <w:t>TF_</w:t>
+      </w:r>
+      <w:r>
+        <w:t>OM</w:t>
+      </w:r>
+      <w:r>
+        <w:t>_01</w:t>
+      </w:r>
+    </w:p>
+    <w:p>
+      <w:pPr>
+        <w:pStyle w:val="Paragrafoelenco"/>
+        <w:numPr>
+          <w:ilvl w:val="1"/>
+          <w:numId w:val="14"/>
+        </w:numPr>
+      </w:pPr>
+      <w:r>
+        <w:t>TF_OM_0</w:t>
+      </w:r>
+      <w:r>
+        <w:t>2</w:t>
+      </w:r>
+    </w:p>
+    <w:p>
+      <w:pPr>
+        <w:pStyle w:val="Paragrafoelenco"/>
+        <w:numPr>
+          <w:ilvl w:val="1"/>
+          <w:numId w:val="14"/>
+        </w:numPr>
+      </w:pPr>
+      <w:r>
+        <w:t>TF_OM_0</w:t>
+      </w:r>
+      <w:r>
+        <w:t>3</w:t>
+      </w:r>
+    </w:p>
+    <w:p>
+      <w:pPr>
+        <w:pStyle w:val="Paragrafoelenco"/>
+        <w:numPr>
+          <w:ilvl w:val="1"/>
+          <w:numId w:val="14"/>
+        </w:numPr>
+      </w:pPr>
+      <w:r>
+        <w:t>TF_OM_0</w:t>
+      </w:r>
+      <w:r>
+        <w:t>4</w:t>
+      </w:r>
+    </w:p>
+    <w:p>
+      <w:pPr>
+        <w:pStyle w:val="Paragrafoelenco"/>
+        <w:numPr>
+          <w:ilvl w:val="0"/>
+          <w:numId w:val="14"/>
+        </w:numPr>
+      </w:pPr>
+      <w:r>
+        <w:t>CarrelloServiceTest</w:t>
+      </w:r>
+    </w:p>
+    <w:p>
+      <w:pPr>
+        <w:ind w:left="1428" w:firstLine="0"/>
+      </w:pPr>
+    </w:p>
     <w:p/>
-    <w:p/>
     <w:p>
       <w:pPr>
         <w:pStyle w:val="Titolo2"/>
       </w:pPr>
       <w:bookmarkStart w:id="37" w:name="_Toc218019539"/>
       <w:r>
-        <w:lastRenderedPageBreak/>
         <w:t>Input specifications</w:t>
       </w:r>
       <w:bookmarkEnd w:id="37"/>
@@ -15434,6 +15939,7 @@
                 <w:sz w:val="22"/>
                 <w:szCs w:val="22"/>
               </w:rPr>
+              <w:lastRenderedPageBreak/>
               <w:t>TF-OM-03</w:t>
             </w:r>
           </w:p>
@@ -15812,7 +16318,6 @@
       </w:pPr>
       <w:bookmarkStart w:id="42" w:name="_Toc218019544"/>
       <w:r>
-        <w:lastRenderedPageBreak/>
         <w:t xml:space="preserve">TC_OM_02 – </w:t>
       </w:r>
       <w:r>
@@ -15852,7 +16357,10 @@
         </w:numPr>
       </w:pPr>
       <w:r>
-        <w:t>Controller: OrderNowServlet, CheOutServlet</w:t>
+        <w:t xml:space="preserve">Controller: </w:t>
+      </w:r>
+      <w:r>
+        <w:t>OrderNowServlet</w:t>
       </w:r>
     </w:p>
     <w:p>
@@ -15867,7 +16375,81 @@
         <w:t>DAO: UtenteDAO, RigaOrdineDAO, ProdottoDAO</w:t>
       </w:r>
     </w:p>
-    <w:p/>
+    <w:p>
+      <w:pPr>
+        <w:pStyle w:val="Titolo3"/>
+        <w:rPr>
+          <w:b/>
+          <w:bCs/>
+          <w:szCs w:val="28"/>
+        </w:rPr>
+      </w:pPr>
+      <w:r>
+        <w:rPr>
+          <w:b/>
+          <w:bCs/>
+          <w:szCs w:val="28"/>
+        </w:rPr>
+        <w:t>Classi di test</w:t>
+      </w:r>
+    </w:p>
+    <w:p>
+      <w:pPr>
+        <w:pStyle w:val="Paragrafoelenco"/>
+        <w:numPr>
+          <w:ilvl w:val="0"/>
+          <w:numId w:val="14"/>
+        </w:numPr>
+      </w:pPr>
+      <w:r>
+        <w:t>OrderNowServletIntegrationTest</w:t>
+      </w:r>
+    </w:p>
+    <w:p>
+      <w:pPr>
+        <w:pStyle w:val="Paragrafoelenco"/>
+        <w:numPr>
+          <w:ilvl w:val="1"/>
+          <w:numId w:val="14"/>
+        </w:numPr>
+      </w:pPr>
+      <w:r>
+        <w:t>TF_OM_0</w:t>
+      </w:r>
+      <w:r>
+        <w:t>5</w:t>
+      </w:r>
+    </w:p>
+    <w:p>
+      <w:pPr>
+        <w:pStyle w:val="Paragrafoelenco"/>
+        <w:numPr>
+          <w:ilvl w:val="1"/>
+          <w:numId w:val="14"/>
+        </w:numPr>
+      </w:pPr>
+      <w:r>
+        <w:t>TF_OM_0</w:t>
+      </w:r>
+      <w:r>
+        <w:t>6</w:t>
+      </w:r>
+    </w:p>
+    <w:p>
+      <w:pPr>
+        <w:pStyle w:val="Paragrafoelenco"/>
+        <w:numPr>
+          <w:ilvl w:val="1"/>
+          <w:numId w:val="14"/>
+        </w:numPr>
+      </w:pPr>
+      <w:r>
+        <w:t>TF_OM_0</w:t>
+      </w:r>
+      <w:r>
+        <w:t>7</w:t>
+      </w:r>
+    </w:p>
     <w:p/>
     <w:p>
       <w:pPr>
@@ -15930,6 +16512,7 @@
         </w:rPr>
       </w:pPr>
       <w:r>
+        <w:lastRenderedPageBreak/>
         <w:t>Scelte: non autenticato, autenticato</w:t>
       </w:r>
     </w:p>
@@ -16714,7 +17297,6 @@
       </w:pPr>
       <w:bookmarkStart w:id="48" w:name="_Toc218019550"/>
       <w:r>
-        <w:lastRenderedPageBreak/>
         <w:t>Intercase dependencies</w:t>
       </w:r>
       <w:bookmarkEnd w:id="48"/>
@@ -16799,6 +17381,7 @@
         </w:numPr>
       </w:pPr>
       <w:r>
+        <w:lastRenderedPageBreak/>
         <w:t xml:space="preserve">Controller: </w:t>
       </w:r>
       <w:r>
@@ -16832,7 +17415,86 @@
         <w:t>Service: carrello in sessione</w:t>
       </w:r>
     </w:p>
-    <w:p/>
+    <w:p>
+      <w:pPr>
+        <w:pStyle w:val="Titolo3"/>
+        <w:rPr>
+          <w:b/>
+          <w:bCs/>
+          <w:szCs w:val="28"/>
+        </w:rPr>
+      </w:pPr>
+      <w:r>
+        <w:rPr>
+          <w:b/>
+          <w:bCs/>
+          <w:szCs w:val="28"/>
+        </w:rPr>
+        <w:t>Classi di test</w:t>
+      </w:r>
+    </w:p>
+    <w:p>
+      <w:pPr>
+        <w:pStyle w:val="Paragrafoelenco"/>
+        <w:numPr>
+          <w:ilvl w:val="0"/>
+          <w:numId w:val="14"/>
+        </w:numPr>
+      </w:pPr>
+      <w:r>
+        <w:t>CheckoutServletIntegrationTest</w:t>
+      </w:r>
+    </w:p>
+    <w:p>
+      <w:pPr>
+        <w:pStyle w:val="Paragrafoelenco"/>
+        <w:numPr>
+          <w:ilvl w:val="1"/>
+          <w:numId w:val="14"/>
+        </w:numPr>
+      </w:pPr>
+      <w:r>
+        <w:t>TF_OM_0</w:t>
+      </w:r>
+      <w:r>
+        <w:t>8</w:t>
+      </w:r>
+    </w:p>
+    <w:p>
+      <w:pPr>
+        <w:pStyle w:val="Paragrafoelenco"/>
+        <w:numPr>
+          <w:ilvl w:val="1"/>
+          <w:numId w:val="14"/>
+        </w:numPr>
+      </w:pPr>
+      <w:r>
+        <w:t>TF_OM_0</w:t>
+      </w:r>
+      <w:r>
+        <w:t>9</w:t>
+      </w:r>
+    </w:p>
+    <w:p>
+      <w:pPr>
+        <w:pStyle w:val="Paragrafoelenco"/>
+        <w:numPr>
+          <w:ilvl w:val="1"/>
+          <w:numId w:val="14"/>
+        </w:numPr>
+      </w:pPr>
+      <w:r>
+        <w:t>TF_OM_</w:t>
+      </w:r>
+      <w:r>
+        <w:t>10</w:t>
+      </w:r>
+    </w:p>
+    <w:p>
+      <w:pPr>
+        <w:ind w:left="473" w:firstLine="0"/>
+      </w:pPr>
+    </w:p>
     <w:p/>
     <w:p>
       <w:pPr>
@@ -17901,6 +18563,7 @@
         </w:numPr>
       </w:pPr>
       <w:r>
+        <w:lastRenderedPageBreak/>
         <w:t>Script automatico (se presente): IMG_COD_00</w:t>
       </w:r>
     </w:p>
@@ -18058,6 +18721,180 @@
     </w:p>
     <w:p>
       <w:pPr>
+        <w:pStyle w:val="Titolo3"/>
+        <w:rPr>
+          <w:b/>
+          <w:bCs/>
+          <w:szCs w:val="28"/>
+        </w:rPr>
+      </w:pPr>
+      <w:r>
+        <w:rPr>
+          <w:b/>
+          <w:bCs/>
+          <w:szCs w:val="28"/>
+        </w:rPr>
+        <w:t>Classi di test</w:t>
+      </w:r>
+    </w:p>
+    <w:p>
+      <w:pPr>
+        <w:pStyle w:val="Paragrafoelenco"/>
+        <w:numPr>
+          <w:ilvl w:val="0"/>
+          <w:numId w:val="14"/>
+        </w:numPr>
+      </w:pPr>
+      <w:r>
+        <w:t>AdminAddStockServletIntegrationTest</w:t>
+      </w:r>
+    </w:p>
+    <w:p>
+      <w:pPr>
+        <w:pStyle w:val="Paragrafoelenco"/>
+        <w:numPr>
+          <w:ilvl w:val="1"/>
+          <w:numId w:val="14"/>
+        </w:numPr>
+      </w:pPr>
+      <w:r>
+        <w:t>TF_</w:t>
+      </w:r>
+      <w:r>
+        <w:t>ADM</w:t>
+      </w:r>
+      <w:r>
+        <w:t>_0</w:t>
+      </w:r>
+      <w:r>
+        <w:t>2</w:t>
+      </w:r>
+    </w:p>
+    <w:p>
+      <w:pPr>
+        <w:pStyle w:val="Paragrafoelenco"/>
+        <w:numPr>
+          <w:ilvl w:val="1"/>
+          <w:numId w:val="14"/>
+        </w:numPr>
+      </w:pPr>
+      <w:r>
+        <w:t>TF_ADM_0</w:t>
+      </w:r>
+      <w:r>
+        <w:t>3</w:t>
+      </w:r>
+    </w:p>
+    <w:p>
+      <w:pPr>
+        <w:pStyle w:val="Paragrafoelenco"/>
+        <w:numPr>
+          <w:ilvl w:val="1"/>
+          <w:numId w:val="14"/>
+        </w:numPr>
+      </w:pPr>
+      <w:r>
+        <w:t>TF_ADM_0</w:t>
+      </w:r>
+      <w:r>
+        <w:t>5</w:t>
+      </w:r>
+    </w:p>
+    <w:p>
+      <w:pPr>
+        <w:pStyle w:val="Paragrafoelenco"/>
+        <w:numPr>
+          <w:ilvl w:val="0"/>
+          <w:numId w:val="14"/>
+        </w:numPr>
+      </w:pPr>
+      <w:r>
+        <w:t>AdminRemoveStockServletIntegrationTest</w:t>
+      </w:r>
+    </w:p>
+    <w:p>
+      <w:pPr>
+        <w:pStyle w:val="Paragrafoelenco"/>
+        <w:numPr>
+          <w:ilvl w:val="1"/>
+          <w:numId w:val="14"/>
+        </w:numPr>
+      </w:pPr>
+      <w:r>
+        <w:t>TF_ADM_0</w:t>
+      </w:r>
+      <w:r>
+        <w:t>1</w:t>
+      </w:r>
+    </w:p>
+    <w:p>
+      <w:pPr>
+        <w:pStyle w:val="Paragrafoelenco"/>
+        <w:numPr>
+          <w:ilvl w:val="1"/>
+          <w:numId w:val="14"/>
+        </w:numPr>
+      </w:pPr>
+      <w:r>
+        <w:t>TF_ADM_0</w:t>
+      </w:r>
+      <w:r>
+        <w:t>3</w:t>
+      </w:r>
+    </w:p>
+    <w:p>
+      <w:pPr>
+        <w:pStyle w:val="Paragrafoelenco"/>
+        <w:numPr>
+          <w:ilvl w:val="1"/>
+          <w:numId w:val="14"/>
+        </w:numPr>
+      </w:pPr>
+      <w:r>
+        <w:t>TF_ADM_0</w:t>
+      </w:r>
+      <w:r>
+        <w:t>5</w:t>
+      </w:r>
+    </w:p>
+    <w:p>
+      <w:pPr>
+        <w:pStyle w:val="Paragrafoelenco"/>
+        <w:numPr>
+          <w:ilvl w:val="0"/>
+          <w:numId w:val="14"/>
+        </w:numPr>
+      </w:pPr>
+      <w:r>
+        <w:t>ProdottoDaoTest</w:t>
+      </w:r>
+    </w:p>
+    <w:p>
+      <w:pPr>
+        <w:pStyle w:val="Paragrafoelenco"/>
+        <w:numPr>
+          <w:ilvl w:val="1"/>
+          <w:numId w:val="14"/>
+        </w:numPr>
+      </w:pPr>
+      <w:r>
+        <w:t>TF_ADM_03</w:t>
+      </w:r>
+    </w:p>
+    <w:p>
+      <w:pPr>
+        <w:pStyle w:val="Paragrafoelenco"/>
+        <w:numPr>
+          <w:ilvl w:val="1"/>
+          <w:numId w:val="14"/>
+        </w:numPr>
+      </w:pPr>
+      <w:r>
+        <w:t>TF_ADM_04</w:t>
+      </w:r>
+    </w:p>
+    <w:p>
+      <w:pPr>
         <w:ind w:left="473" w:firstLine="0"/>
       </w:pPr>
     </w:p>
@@ -18203,6 +19040,7 @@
         </w:rPr>
       </w:pPr>
       <w:r>
+        <w:lastRenderedPageBreak/>
         <w:t>Scelta: valido, non esistente</w:t>
       </w:r>
     </w:p>
@@ -18499,7 +19337,6 @@
                 <w:sz w:val="22"/>
                 <w:szCs w:val="22"/>
               </w:rPr>
-              <w:lastRenderedPageBreak/>
               <w:t>TF-ADM-01</w:t>
             </w:r>
           </w:p>
@@ -19404,6 +20241,7 @@
         </w:numPr>
       </w:pPr>
       <w:r>
+        <w:lastRenderedPageBreak/>
         <w:t xml:space="preserve">Controller:, </w:t>
       </w:r>
     </w:p>
@@ -19442,6 +20280,125 @@
       <w:r>
         <w:t>DB: tabella prodotti</w:t>
       </w:r>
+    </w:p>
+    <w:p>
+      <w:pPr>
+        <w:pStyle w:val="Titolo3"/>
+        <w:rPr>
+          <w:b/>
+          <w:bCs/>
+          <w:szCs w:val="28"/>
+        </w:rPr>
+      </w:pPr>
+      <w:r>
+        <w:rPr>
+          <w:b/>
+          <w:bCs/>
+          <w:szCs w:val="28"/>
+        </w:rPr>
+        <w:t>Classi di test</w:t>
+      </w:r>
+    </w:p>
+    <w:p>
+      <w:pPr>
+        <w:pStyle w:val="Paragrafoelenco"/>
+        <w:numPr>
+          <w:ilvl w:val="0"/>
+          <w:numId w:val="14"/>
+        </w:numPr>
+      </w:pPr>
+      <w:r>
+        <w:t>AdminModifyPriceProdottoIntegrationTest</w:t>
+      </w:r>
+    </w:p>
+    <w:p>
+      <w:pPr>
+        <w:pStyle w:val="Paragrafoelenco"/>
+        <w:numPr>
+          <w:ilvl w:val="1"/>
+          <w:numId w:val="14"/>
+        </w:numPr>
+      </w:pPr>
+      <w:r>
+        <w:t>TF_ADM_0</w:t>
+      </w:r>
+      <w:r>
+        <w:t>6</w:t>
+      </w:r>
+    </w:p>
+    <w:p>
+      <w:pPr>
+        <w:pStyle w:val="Paragrafoelenco"/>
+        <w:numPr>
+          <w:ilvl w:val="1"/>
+          <w:numId w:val="14"/>
+        </w:numPr>
+      </w:pPr>
+      <w:r>
+        <w:t>TF_ADM_0</w:t>
+      </w:r>
+      <w:r>
+        <w:t>7</w:t>
+      </w:r>
+    </w:p>
+    <w:p>
+      <w:pPr>
+        <w:pStyle w:val="Paragrafoelenco"/>
+        <w:numPr>
+          <w:ilvl w:val="1"/>
+          <w:numId w:val="14"/>
+        </w:numPr>
+      </w:pPr>
+      <w:r>
+        <w:t>TF_ADM_0</w:t>
+      </w:r>
+      <w:r>
+        <w:t>8</w:t>
+      </w:r>
+    </w:p>
+    <w:p>
+      <w:pPr>
+        <w:pStyle w:val="Paragrafoelenco"/>
+        <w:numPr>
+          <w:ilvl w:val="1"/>
+          <w:numId w:val="14"/>
+        </w:numPr>
+      </w:pPr>
+      <w:r>
+        <w:t>TF_ADM_0</w:t>
+      </w:r>
+      <w:r>
+        <w:t>9</w:t>
+      </w:r>
+    </w:p>
+    <w:p>
+      <w:pPr>
+        <w:pStyle w:val="Paragrafoelenco"/>
+        <w:numPr>
+          <w:ilvl w:val="0"/>
+          <w:numId w:val="14"/>
+        </w:numPr>
+      </w:pPr>
+      <w:r>
+        <w:t>ProdottoDaoTest</w:t>
+      </w:r>
+    </w:p>
+    <w:p>
+      <w:pPr>
+        <w:pStyle w:val="Paragrafoelenco"/>
+        <w:numPr>
+          <w:ilvl w:val="1"/>
+          <w:numId w:val="14"/>
+        </w:numPr>
+      </w:pPr>
+      <w:r>
+        <w:t>TF_ADM_07</w:t>
+      </w:r>
+    </w:p>
+    <w:p>
+      <w:pPr>
+        <w:ind w:left="473" w:firstLine="0"/>
+      </w:pPr>
     </w:p>
     <w:p>
       <w:pPr>
@@ -20488,6 +21445,7 @@
       </w:pPr>
       <w:bookmarkStart w:id="67" w:name="_Toc218019569"/>
       <w:r>
+        <w:lastRenderedPageBreak/>
         <w:t>Environmental Needs</w:t>
       </w:r>
       <w:bookmarkEnd w:id="67"/>
@@ -20698,6 +21656,123 @@
         <w:t>DB: tabella prodotti</w:t>
       </w:r>
     </w:p>
+    <w:p>
+      <w:pPr>
+        <w:pStyle w:val="Titolo3"/>
+        <w:rPr>
+          <w:b/>
+          <w:bCs/>
+          <w:szCs w:val="28"/>
+        </w:rPr>
+      </w:pPr>
+      <w:r>
+        <w:rPr>
+          <w:b/>
+          <w:bCs/>
+          <w:szCs w:val="28"/>
+        </w:rPr>
+        <w:t>Classi di test</w:t>
+      </w:r>
+    </w:p>
+    <w:p>
+      <w:pPr>
+        <w:pStyle w:val="Paragrafoelenco"/>
+        <w:numPr>
+          <w:ilvl w:val="0"/>
+          <w:numId w:val="14"/>
+        </w:numPr>
+      </w:pPr>
+      <w:r>
+        <w:t>AdminInsertNewProductServletIntegrationTest</w:t>
+      </w:r>
+    </w:p>
+    <w:p>
+      <w:pPr>
+        <w:pStyle w:val="Paragrafoelenco"/>
+        <w:numPr>
+          <w:ilvl w:val="1"/>
+          <w:numId w:val="14"/>
+        </w:numPr>
+      </w:pPr>
+      <w:r>
+        <w:t>TF_ADM_</w:t>
+      </w:r>
+      <w:r>
+        <w:t>10</w:t>
+      </w:r>
+    </w:p>
+    <w:p>
+      <w:pPr>
+        <w:pStyle w:val="Paragrafoelenco"/>
+        <w:numPr>
+          <w:ilvl w:val="1"/>
+          <w:numId w:val="14"/>
+        </w:numPr>
+      </w:pPr>
+      <w:r>
+        <w:t>TF_ADM_</w:t>
+      </w:r>
+      <w:r>
+        <w:t>11</w:t>
+      </w:r>
+    </w:p>
+    <w:p>
+      <w:pPr>
+        <w:pStyle w:val="Paragrafoelenco"/>
+        <w:numPr>
+          <w:ilvl w:val="1"/>
+          <w:numId w:val="14"/>
+        </w:numPr>
+      </w:pPr>
+      <w:r>
+        <w:t>TF_ADM_</w:t>
+      </w:r>
+      <w:r>
+        <w:t>12</w:t>
+      </w:r>
+    </w:p>
+    <w:p>
+      <w:pPr>
+        <w:pStyle w:val="Paragrafoelenco"/>
+        <w:numPr>
+          <w:ilvl w:val="1"/>
+          <w:numId w:val="14"/>
+        </w:numPr>
+      </w:pPr>
+      <w:r>
+        <w:t>TF_ADM_</w:t>
+      </w:r>
+      <w:r>
+        <w:t>13</w:t>
+      </w:r>
+    </w:p>
+    <w:p>
+      <w:pPr>
+        <w:pStyle w:val="Paragrafoelenco"/>
+        <w:numPr>
+          <w:ilvl w:val="0"/>
+          <w:numId w:val="14"/>
+        </w:numPr>
+      </w:pPr>
+      <w:r>
+        <w:t>ProdottoDaoTest</w:t>
+      </w:r>
+    </w:p>
+    <w:p>
+      <w:pPr>
+        <w:pStyle w:val="Paragrafoelenco"/>
+        <w:numPr>
+          <w:ilvl w:val="1"/>
+          <w:numId w:val="14"/>
+        </w:numPr>
+      </w:pPr>
+      <w:r>
+        <w:t>TF_ADM_</w:t>
+      </w:r>
+      <w:r>
+        <w:t>13</w:t>
+      </w:r>
+    </w:p>
     <w:p/>
     <w:p/>
     <w:p>
@@ -20824,6 +21899,7 @@
         </w:numPr>
       </w:pPr>
       <w:r>
+        <w:lastRenderedPageBreak/>
         <w:t xml:space="preserve">Categoria: </w:t>
       </w:r>
       <w:r>
@@ -21820,7 +22896,6 @@
       </w:pPr>
       <w:bookmarkStart w:id="74" w:name="_Toc218019576"/>
       <w:r>
-        <w:lastRenderedPageBreak/>
         <w:t>Environmental Needs</w:t>
       </w:r>
       <w:bookmarkEnd w:id="74"/>
@@ -21961,6 +23036,7 @@
       </w:pPr>
       <w:bookmarkStart w:id="78" w:name="_Toc218019580"/>
       <w:r>
+        <w:lastRenderedPageBreak/>
         <w:t>Test items</w:t>
       </w:r>
       <w:bookmarkEnd w:id="78"/>
@@ -22006,6 +23082,86 @@
       <w:r>
         <w:t>ProdottoDAO</w:t>
       </w:r>
+    </w:p>
+    <w:p>
+      <w:pPr>
+        <w:pStyle w:val="Titolo3"/>
+        <w:rPr>
+          <w:b/>
+          <w:bCs/>
+          <w:szCs w:val="28"/>
+        </w:rPr>
+      </w:pPr>
+      <w:r>
+        <w:rPr>
+          <w:b/>
+          <w:bCs/>
+          <w:szCs w:val="28"/>
+        </w:rPr>
+        <w:t>Classi di test</w:t>
+      </w:r>
+    </w:p>
+    <w:p>
+      <w:pPr>
+        <w:pStyle w:val="Paragrafoelenco"/>
+        <w:numPr>
+          <w:ilvl w:val="0"/>
+          <w:numId w:val="14"/>
+        </w:numPr>
+      </w:pPr>
+      <w:r>
+        <w:t>AdminDeleteProdottoServletIntegrationTest</w:t>
+      </w:r>
+    </w:p>
+    <w:p>
+      <w:pPr>
+        <w:pStyle w:val="Paragrafoelenco"/>
+        <w:numPr>
+          <w:ilvl w:val="1"/>
+          <w:numId w:val="14"/>
+        </w:numPr>
+      </w:pPr>
+      <w:r>
+        <w:t>TF_ADM_</w:t>
+      </w:r>
+      <w:r>
+        <w:t>14</w:t>
+      </w:r>
+    </w:p>
+    <w:p>
+      <w:pPr>
+        <w:pStyle w:val="Paragrafoelenco"/>
+        <w:numPr>
+          <w:ilvl w:val="1"/>
+          <w:numId w:val="14"/>
+        </w:numPr>
+      </w:pPr>
+      <w:r>
+        <w:t>TF_ADM_</w:t>
+      </w:r>
+      <w:r>
+        <w:t>15</w:t>
+      </w:r>
+    </w:p>
+    <w:p>
+      <w:pPr>
+        <w:pStyle w:val="Paragrafoelenco"/>
+        <w:numPr>
+          <w:ilvl w:val="1"/>
+          <w:numId w:val="14"/>
+        </w:numPr>
+      </w:pPr>
+      <w:r>
+        <w:t>TF_ADM_</w:t>
+      </w:r>
+      <w:r>
+        <w:t>16</w:t>
+      </w:r>
+    </w:p>
+    <w:p>
+      <w:pPr>
+        <w:ind w:left="473" w:firstLine="0"/>
+      </w:pPr>
     </w:p>
     <w:p/>
     <w:p/>
@@ -23025,7 +24181,10 @@
         </w:numPr>
       </w:pPr>
       <w:r>
-        <w:t xml:space="preserve">UI: </w:t>
+        <w:t xml:space="preserve">Controller: </w:t>
+      </w:r>
+      <w:r>
+        <w:t>ModifyOrderDataServlet</w:t>
       </w:r>
     </w:p>
     <w:p>
@@ -23037,7 +24196,28 @@
         </w:numPr>
       </w:pPr>
       <w:r>
-        <w:t xml:space="preserve">Controller: </w:t>
+        <w:t xml:space="preserve">DAO: </w:t>
+      </w:r>
+      <w:r>
+        <w:t>RigaOrdineDao</w:t>
+      </w:r>
+    </w:p>
+    <w:p>
+      <w:pPr>
+        <w:pStyle w:val="Titolo3"/>
+        <w:rPr>
+          <w:b/>
+          <w:bCs/>
+          <w:szCs w:val="28"/>
+        </w:rPr>
+      </w:pPr>
+      <w:r>
+        <w:rPr>
+          <w:b/>
+          <w:bCs/>
+          <w:szCs w:val="28"/>
+        </w:rPr>
+        <w:t>Classi di test</w:t>
       </w:r>
     </w:p>
     <w:p>
@@ -23045,11 +24225,56 @@
         <w:pStyle w:val="Paragrafoelenco"/>
         <w:numPr>
           <w:ilvl w:val="0"/>
-          <w:numId w:val="2"/>
-        </w:numPr>
-      </w:pPr>
-      <w:r>
-        <w:t xml:space="preserve">DAO: </w:t>
+          <w:numId w:val="14"/>
+        </w:numPr>
+      </w:pPr>
+      <w:r>
+        <w:t>ModifyOrderDataServletIntegrationTest</w:t>
+      </w:r>
+    </w:p>
+    <w:p>
+      <w:pPr>
+        <w:pStyle w:val="Paragrafoelenco"/>
+        <w:numPr>
+          <w:ilvl w:val="1"/>
+          <w:numId w:val="14"/>
+        </w:numPr>
+      </w:pPr>
+      <w:r>
+        <w:t>TF_ADM_1</w:t>
+      </w:r>
+      <w:r>
+        <w:t>7</w:t>
+      </w:r>
+    </w:p>
+    <w:p>
+      <w:pPr>
+        <w:pStyle w:val="Paragrafoelenco"/>
+        <w:numPr>
+          <w:ilvl w:val="1"/>
+          <w:numId w:val="14"/>
+        </w:numPr>
+      </w:pPr>
+      <w:r>
+        <w:t>TF_ADM_1</w:t>
+      </w:r>
+      <w:r>
+        <w:t>8</w:t>
+      </w:r>
+    </w:p>
+    <w:p>
+      <w:pPr>
+        <w:pStyle w:val="Paragrafoelenco"/>
+        <w:numPr>
+          <w:ilvl w:val="1"/>
+          <w:numId w:val="14"/>
+        </w:numPr>
+      </w:pPr>
+      <w:r>
+        <w:t>TF_ADM_1</w:t>
+      </w:r>
+      <w:r>
+        <w:t>9</w:t>
       </w:r>
     </w:p>
     <w:p>
@@ -23057,11 +24282,11 @@
         <w:pStyle w:val="Paragrafoelenco"/>
         <w:numPr>
           <w:ilvl w:val="0"/>
-          <w:numId w:val="2"/>
-        </w:numPr>
-      </w:pPr>
-      <w:r>
-        <w:t xml:space="preserve">Service: </w:t>
+          <w:numId w:val="14"/>
+        </w:numPr>
+      </w:pPr>
+      <w:r>
+        <w:t>RigaOrdineDaoTest</w:t>
       </w:r>
     </w:p>
     <w:p/>
@@ -23564,7 +24789,6 @@
                 <w:sz w:val="22"/>
                 <w:szCs w:val="22"/>
               </w:rPr>
-              <w:lastRenderedPageBreak/>
               <w:t>TF-ADM-1</w:t>
             </w:r>
             <w:r>
@@ -24013,6 +25237,7 @@
       </w:pPr>
       <w:bookmarkStart w:id="88" w:name="_Toc218019590"/>
       <w:r>
+        <w:lastRenderedPageBreak/>
         <w:t>Environmental Needs</w:t>
       </w:r>
       <w:bookmarkEnd w:id="88"/>
@@ -24747,7 +25972,7 @@
         <w:rFonts w:ascii="Symbol" w:hAnsi="Symbol" w:hint="default"/>
       </w:rPr>
     </w:lvl>
-    <w:lvl w:ilvl="1" w:tplc="04100003" w:tentative="1">
+    <w:lvl w:ilvl="1" w:tplc="04100003">
       <w:start w:val="1"/>
       <w:numFmt w:val="bullet"/>
       <w:lvlText w:val="o"/>
@@ -25220,6 +26445,119 @@
     </w:lvl>
   </w:abstractNum>
   <w:abstractNum w:abstractNumId="7" w15:restartNumberingAfterBreak="0">
+    <w:nsid w:val="5C597B4C"/>
+    <w:multiLevelType w:val="hybridMultilevel"/>
+    <w:tmpl w:val="C32E4688"/>
+    <w:lvl w:ilvl="0" w:tplc="04100001">
+      <w:start w:val="1"/>
+      <w:numFmt w:val="bullet"/>
+      <w:lvlText w:val=""/>
+      <w:lvlJc w:val="left"/>
+      <w:pPr>
+        <w:ind w:left="1068" w:hanging="360"/>
+      </w:pPr>
+      <w:rPr>
+        <w:rFonts w:ascii="Symbol" w:hAnsi="Symbol" w:hint="default"/>
+      </w:rPr>
+    </w:lvl>
+    <w:lvl w:ilvl="1" w:tplc="04100003">
+      <w:start w:val="1"/>
+      <w:numFmt w:val="bullet"/>
+      <w:lvlText w:val="o"/>
+      <w:lvlJc w:val="left"/>
+      <w:pPr>
+        <w:ind w:left="1788" w:hanging="360"/>
+      </w:pPr>
+      <w:rPr>
+        <w:rFonts w:ascii="Courier New" w:hAnsi="Courier New" w:cs="Courier New" w:hint="default"/>
+      </w:rPr>
+    </w:lvl>
+    <w:lvl w:ilvl="2" w:tplc="04100005">
+      <w:start w:val="1"/>
+      <w:numFmt w:val="bullet"/>
+      <w:lvlText w:val=""/>
+      <w:lvlJc w:val="left"/>
+      <w:pPr>
+        <w:ind w:left="2508" w:hanging="360"/>
+      </w:pPr>
+      <w:rPr>
+        <w:rFonts w:ascii="Wingdings" w:hAnsi="Wingdings" w:hint="default"/>
+      </w:rPr>
+    </w:lvl>
+    <w:lvl w:ilvl="3" w:tplc="04100001" w:tentative="1">
+      <w:start w:val="1"/>
+      <w:numFmt w:val="bullet"/>
+      <w:lvlText w:val=""/>
+      <w:lvlJc w:val="left"/>
+      <w:pPr>
+        <w:ind w:left="3228" w:hanging="360"/>
+      </w:pPr>
+      <w:rPr>
+        <w:rFonts w:ascii="Symbol" w:hAnsi="Symbol" w:hint="default"/>
+      </w:rPr>
+    </w:lvl>
+    <w:lvl w:ilvl="4" w:tplc="04100003" w:tentative="1">
+      <w:start w:val="1"/>
+      <w:numFmt w:val="bullet"/>
+      <w:lvlText w:val="o"/>
+      <w:lvlJc w:val="left"/>
+      <w:pPr>
+        <w:ind w:left="3948" w:hanging="360"/>
+      </w:pPr>
+      <w:rPr>
+        <w:rFonts w:ascii="Courier New" w:hAnsi="Courier New" w:cs="Courier New" w:hint="default"/>
+      </w:rPr>
+    </w:lvl>
+    <w:lvl w:ilvl="5" w:tplc="04100005" w:tentative="1">
+      <w:start w:val="1"/>
+      <w:numFmt w:val="bullet"/>
+      <w:lvlText w:val=""/>
+      <w:lvlJc w:val="left"/>
+      <w:pPr>
+        <w:ind w:left="4668" w:hanging="360"/>
+      </w:pPr>
+      <w:rPr>
+        <w:rFonts w:ascii="Wingdings" w:hAnsi="Wingdings" w:hint="default"/>
+      </w:rPr>
+    </w:lvl>
+    <w:lvl w:ilvl="6" w:tplc="04100001" w:tentative="1">
+      <w:start w:val="1"/>
+      <w:numFmt w:val="bullet"/>
+      <w:lvlText w:val=""/>
+      <w:lvlJc w:val="left"/>
+      <w:pPr>
+        <w:ind w:left="5388" w:hanging="360"/>
+      </w:pPr>
+      <w:rPr>
+        <w:rFonts w:ascii="Symbol" w:hAnsi="Symbol" w:hint="default"/>
+      </w:rPr>
+    </w:lvl>
+    <w:lvl w:ilvl="7" w:tplc="04100003" w:tentative="1">
+      <w:start w:val="1"/>
+      <w:numFmt w:val="bullet"/>
+      <w:lvlText w:val="o"/>
+      <w:lvlJc w:val="left"/>
+      <w:pPr>
+        <w:ind w:left="6108" w:hanging="360"/>
+      </w:pPr>
+      <w:rPr>
+        <w:rFonts w:ascii="Courier New" w:hAnsi="Courier New" w:cs="Courier New" w:hint="default"/>
+      </w:rPr>
+    </w:lvl>
+    <w:lvl w:ilvl="8" w:tplc="04100005" w:tentative="1">
+      <w:start w:val="1"/>
+      <w:numFmt w:val="bullet"/>
+      <w:lvlText w:val=""/>
+      <w:lvlJc w:val="left"/>
+      <w:pPr>
+        <w:ind w:left="6828" w:hanging="360"/>
+      </w:pPr>
+      <w:rPr>
+        <w:rFonts w:ascii="Wingdings" w:hAnsi="Wingdings" w:hint="default"/>
+      </w:rPr>
+    </w:lvl>
+  </w:abstractNum>
+  <w:abstractNum w:abstractNumId="8" w15:restartNumberingAfterBreak="0">
     <w:nsid w:val="5E6807F6"/>
     <w:multiLevelType w:val="multilevel"/>
     <w:tmpl w:val="4F528A46"/>
@@ -25368,7 +26706,7 @@
       </w:rPr>
     </w:lvl>
   </w:abstractNum>
-  <w:abstractNum w:abstractNumId="8" w15:restartNumberingAfterBreak="0">
+  <w:abstractNum w:abstractNumId="9" w15:restartNumberingAfterBreak="0">
     <w:nsid w:val="605F5978"/>
     <w:multiLevelType w:val="multilevel"/>
     <w:tmpl w:val="1FE267BA"/>
@@ -25517,7 +26855,7 @@
       </w:rPr>
     </w:lvl>
   </w:abstractNum>
-  <w:abstractNum w:abstractNumId="9" w15:restartNumberingAfterBreak="0">
+  <w:abstractNum w:abstractNumId="10" w15:restartNumberingAfterBreak="0">
     <w:nsid w:val="668D7FF5"/>
     <w:multiLevelType w:val="hybridMultilevel"/>
     <w:tmpl w:val="392EEB14"/>
@@ -25630,7 +26968,7 @@
       </w:rPr>
     </w:lvl>
   </w:abstractNum>
-  <w:abstractNum w:abstractNumId="10" w15:restartNumberingAfterBreak="0">
+  <w:abstractNum w:abstractNumId="11" w15:restartNumberingAfterBreak="0">
     <w:nsid w:val="6D1D44C3"/>
     <w:multiLevelType w:val="hybridMultilevel"/>
     <w:tmpl w:val="2AB4C7A0"/>
@@ -25743,7 +27081,97 @@
       </w:rPr>
     </w:lvl>
   </w:abstractNum>
-  <w:abstractNum w:abstractNumId="11" w15:restartNumberingAfterBreak="0">
+  <w:abstractNum w:abstractNumId="12" w15:restartNumberingAfterBreak="0">
+    <w:nsid w:val="71187C3F"/>
+    <w:multiLevelType w:val="hybridMultilevel"/>
+    <w:tmpl w:val="B158F21E"/>
+    <w:lvl w:ilvl="0" w:tplc="362C8C58">
+      <w:start w:val="1"/>
+      <w:numFmt w:val="decimal"/>
+      <w:pStyle w:val="Titolo3"/>
+      <w:lvlText w:val="%1.1.1"/>
+      <w:lvlJc w:val="left"/>
+      <w:pPr>
+        <w:ind w:left="833" w:hanging="360"/>
+      </w:pPr>
+      <w:rPr>
+        <w:rFonts w:hint="default"/>
+      </w:rPr>
+    </w:lvl>
+    <w:lvl w:ilvl="1" w:tplc="04100019" w:tentative="1">
+      <w:start w:val="1"/>
+      <w:numFmt w:val="lowerLetter"/>
+      <w:lvlText w:val="%2."/>
+      <w:lvlJc w:val="left"/>
+      <w:pPr>
+        <w:ind w:left="1553" w:hanging="360"/>
+      </w:pPr>
+    </w:lvl>
+    <w:lvl w:ilvl="2" w:tplc="0410001B" w:tentative="1">
+      <w:start w:val="1"/>
+      <w:numFmt w:val="lowerRoman"/>
+      <w:lvlText w:val="%3."/>
+      <w:lvlJc w:val="right"/>
+      <w:pPr>
+        <w:ind w:left="2273" w:hanging="180"/>
+      </w:pPr>
+    </w:lvl>
+    <w:lvl w:ilvl="3" w:tplc="0410000F" w:tentative="1">
+      <w:start w:val="1"/>
+      <w:numFmt w:val="decimal"/>
+      <w:lvlText w:val="%4."/>
+      <w:lvlJc w:val="left"/>
+      <w:pPr>
+        <w:ind w:left="2993" w:hanging="360"/>
+      </w:pPr>
+    </w:lvl>
+    <w:lvl w:ilvl="4" w:tplc="04100019" w:tentative="1">
+      <w:start w:val="1"/>
+      <w:numFmt w:val="lowerLetter"/>
+      <w:lvlText w:val="%5."/>
+      <w:lvlJc w:val="left"/>
+      <w:pPr>
+        <w:ind w:left="3713" w:hanging="360"/>
+      </w:pPr>
+    </w:lvl>
+    <w:lvl w:ilvl="5" w:tplc="0410001B" w:tentative="1">
+      <w:start w:val="1"/>
+      <w:numFmt w:val="lowerRoman"/>
+      <w:lvlText w:val="%6."/>
+      <w:lvlJc w:val="right"/>
+      <w:pPr>
+        <w:ind w:left="4433" w:hanging="180"/>
+      </w:pPr>
+    </w:lvl>
+    <w:lvl w:ilvl="6" w:tplc="0410000F" w:tentative="1">
+      <w:start w:val="1"/>
+      <w:numFmt w:val="decimal"/>
+      <w:lvlText w:val="%7."/>
+      <w:lvlJc w:val="left"/>
+      <w:pPr>
+        <w:ind w:left="5153" w:hanging="360"/>
+      </w:pPr>
+    </w:lvl>
+    <w:lvl w:ilvl="7" w:tplc="04100019" w:tentative="1">
+      <w:start w:val="1"/>
+      <w:numFmt w:val="lowerLetter"/>
+      <w:lvlText w:val="%8."/>
+      <w:lvlJc w:val="left"/>
+      <w:pPr>
+        <w:ind w:left="5873" w:hanging="360"/>
+      </w:pPr>
+    </w:lvl>
+    <w:lvl w:ilvl="8" w:tplc="0410001B" w:tentative="1">
+      <w:start w:val="1"/>
+      <w:numFmt w:val="lowerRoman"/>
+      <w:lvlText w:val="%9."/>
+      <w:lvlJc w:val="right"/>
+      <w:pPr>
+        <w:ind w:left="6593" w:hanging="180"/>
+      </w:pPr>
+    </w:lvl>
+  </w:abstractNum>
+  <w:abstractNum w:abstractNumId="13" w15:restartNumberingAfterBreak="0">
     <w:nsid w:val="7AB706A4"/>
     <w:multiLevelType w:val="multilevel"/>
     <w:tmpl w:val="C10A20E6"/>
@@ -25975,7 +27403,7 @@
     </w:lvl>
   </w:abstractNum>
   <w:num w:numId="1" w16cid:durableId="2037733668">
-    <w:abstractNumId w:val="11"/>
+    <w:abstractNumId w:val="13"/>
   </w:num>
   <w:num w:numId="2" w16cid:durableId="2111195943">
     <w:abstractNumId w:val="3"/>
@@ -25990,16 +27418,16 @@
     <w:abstractNumId w:val="1"/>
   </w:num>
   <w:num w:numId="6" w16cid:durableId="1858810708">
-    <w:abstractNumId w:val="9"/>
+    <w:abstractNumId w:val="10"/>
   </w:num>
   <w:num w:numId="7" w16cid:durableId="1805269494">
     <w:abstractNumId w:val="2"/>
   </w:num>
   <w:num w:numId="8" w16cid:durableId="1911190434">
-    <w:abstractNumId w:val="8"/>
+    <w:abstractNumId w:val="9"/>
   </w:num>
   <w:num w:numId="9" w16cid:durableId="601032024">
-    <w:abstractNumId w:val="7"/>
+    <w:abstractNumId w:val="8"/>
   </w:num>
   <w:num w:numId="10" w16cid:durableId="1469588537">
     <w:abstractNumId w:val="0"/>
@@ -26008,7 +27436,25 @@
     <w:abstractNumId w:val="4"/>
   </w:num>
   <w:num w:numId="12" w16cid:durableId="1511332858">
-    <w:abstractNumId w:val="10"/>
+    <w:abstractNumId w:val="11"/>
+  </w:num>
+  <w:num w:numId="13" w16cid:durableId="1419596384">
+    <w:abstractNumId w:val="12"/>
+  </w:num>
+  <w:num w:numId="14" w16cid:durableId="1833792591">
+    <w:abstractNumId w:val="7"/>
+  </w:num>
+  <w:num w:numId="15" w16cid:durableId="1606693579">
+    <w:abstractNumId w:val="12"/>
+    <w:lvlOverride w:ilvl="0">
+      <w:startOverride w:val="2"/>
+    </w:lvlOverride>
+  </w:num>
+  <w:num w:numId="16" w16cid:durableId="107820550">
+    <w:abstractNumId w:val="12"/>
+    <w:lvlOverride w:ilvl="0">
+      <w:startOverride w:val="6"/>
+    </w:lvlOverride>
   </w:num>
   <w:numIdMacAtCleanup w:val="12"/>
 </w:numbering>
@@ -26478,22 +27924,24 @@
     <w:uiPriority w:val="9"/>
     <w:unhideWhenUsed/>
     <w:qFormat/>
-    <w:rsid w:val="00F50878"/>
+    <w:rsid w:val="00E11AC0"/>
     <w:pPr>
       <w:keepNext/>
       <w:keepLines/>
+      <w:numPr>
+        <w:numId w:val="13"/>
+      </w:numPr>
       <w:spacing w:before="40" w:after="0"/>
       <w:outlineLvl w:val="2"/>
     </w:pPr>
     <w:rPr>
-      <w:rFonts w:asciiTheme="majorHAnsi" w:eastAsiaTheme="majorEastAsia" w:hAnsiTheme="majorHAnsi" w:cstheme="majorBidi"/>
-      <w:color w:val="0A2F40" w:themeColor="accent1" w:themeShade="7F"/>
+      <w:rFonts w:eastAsiaTheme="majorEastAsia" w:cstheme="majorBidi"/>
+      <w:color w:val="auto"/>
     </w:rPr>
   </w:style>
   <w:style w:type="character" w:default="1" w:styleId="Carpredefinitoparagrafo">
     <w:name w:val="Default Paragraph Font"/>
     <w:uiPriority w:val="1"/>
-    <w:semiHidden/>
     <w:unhideWhenUsed/>
   </w:style>
   <w:style w:type="table" w:default="1" w:styleId="Tabellanormale">
@@ -26705,10 +28153,9 @@
     <w:basedOn w:val="Carpredefinitoparagrafo"/>
     <w:link w:val="Titolo3"/>
     <w:uiPriority w:val="9"/>
-    <w:rsid w:val="00F50878"/>
+    <w:rsid w:val="00E11AC0"/>
     <w:rPr>
-      <w:rFonts w:asciiTheme="majorHAnsi" w:eastAsiaTheme="majorEastAsia" w:hAnsiTheme="majorHAnsi" w:cstheme="majorBidi"/>
-      <w:color w:val="0A2F40" w:themeColor="accent1" w:themeShade="7F"/>
+      <w:rFonts w:ascii="Times New Roman" w:eastAsiaTheme="majorEastAsia" w:hAnsi="Times New Roman" w:cstheme="majorBidi"/>
     </w:rPr>
   </w:style>
   <w:style w:type="paragraph" w:styleId="Sommario4">

</xml_diff>